<commit_message>
Dev server: inject component CSS to avoid stale-style race after restarts
Co-Authored-By: Claude Opus 5.5 <noreply@anthropic.com>
</commit_message>
<xml_diff>
--- a/docs/word/SysPulse Installation Guide.docx
+++ b/docs/word/SysPulse Installation Guide.docx
@@ -120,7 +120,7 @@
           <w:b/>
           <w:sz w:val="21"/>
         </w:rPr>
-        <w:t>08 October 2026</w:t>
+        <w:t>09 October 2026</w:t>
       </w:r>
     </w:p>
     <w:p>
@@ -9333,7 +9333,7 @@
         </w:trPr>
         <w:tc>
           <w:tcPr>
-            <w:tcW w:type="dxa" w:w="4284"/>
+            <w:tcW w:type="dxa" w:w="4819"/>
             <w:tcMar>
               <w:top w:w="60" w:type="dxa"/>
               <w:bottom w:w="60" w:type="dxa"/>
@@ -9358,7 +9358,7 @@
         </w:tc>
         <w:tc>
           <w:tcPr>
-            <w:tcW w:type="dxa" w:w="5354"/>
+            <w:tcW w:type="dxa" w:w="4819"/>
             <w:tcMar>
               <w:top w:w="60" w:type="dxa"/>
               <w:bottom w:w="60" w:type="dxa"/>
@@ -9385,7 +9385,7 @@
       <w:tr>
         <w:tc>
           <w:tcPr>
-            <w:tcW w:type="dxa" w:w="4284"/>
+            <w:tcW w:type="dxa" w:w="4819"/>
             <w:tcMar>
               <w:top w:w="60" w:type="dxa"/>
               <w:bottom w:w="60" w:type="dxa"/>
@@ -9399,7 +9399,6 @@
             </w:pPr>
             <w:r>
               <w:rPr>
-                <w:b/>
                 <w:sz w:val="19"/>
               </w:rPr>
               <w:t xml:space="preserve">Layout looks broken in </w:t>
@@ -9407,17 +9406,30 @@
             <w:r>
               <w:rPr>
                 <w:rFonts w:ascii="Consolas" w:hAnsi="Consolas"/>
-                <w:b/>
                 <w:sz w:val="17"/>
                 <w:shd w:val="clear" w:fill="EEF1F5"/>
               </w:rPr>
               <w:t>npm run dev</w:t>
+            </w:r>
+            <w:r>
+              <w:rPr>
+                <w:sz w:val="19"/>
+              </w:rPr>
+              <w:t xml:space="preserve">, terminal shows </w:t>
+            </w:r>
+            <w:r>
+              <w:rPr>
+                <w:rFonts w:ascii="Consolas" w:hAnsi="Consolas"/>
+                <w:sz w:val="17"/>
+                <w:shd w:val="clear" w:fill="EEF1F5"/>
+              </w:rPr>
+              <w:t>[postcss] … Unknown word SysPulse</w:t>
             </w:r>
           </w:p>
         </w:tc>
         <w:tc>
           <w:tcPr>
-            <w:tcW w:type="dxa" w:w="5354"/>
+            <w:tcW w:type="dxa" w:w="4819"/>
             <w:tcMar>
               <w:top w:w="60" w:type="dxa"/>
               <w:bottom w:w="60" w:type="dxa"/>
@@ -9433,7 +9445,7 @@
               <w:rPr>
                 <w:sz w:val="19"/>
               </w:rPr>
-              <w:t xml:space="preserve">Vite served a stale stylesheet after a restart. Touch </w:t>
+              <w:t xml:space="preserve">Fixed in </w:t>
             </w:r>
             <w:r>
               <w:rPr>
@@ -9441,13 +9453,13 @@
                 <w:sz w:val="17"/>
                 <w:shd w:val="clear" w:fill="EEF1F5"/>
               </w:rPr>
-              <w:t>src-tauri/src/main.rs</w:t>
+              <w:t>ui/vite.config.ts</w:t>
             </w:r>
             <w:r>
               <w:rPr>
                 <w:sz w:val="19"/>
               </w:rPr>
-              <w:t xml:space="preserve"> or restart </w:t>
+              <w:t xml:space="preserve"> (development builds inject component styles instead of serving them separately). If you still see it with an older copy, restart </w:t>
             </w:r>
             <w:r>
               <w:rPr>
@@ -9461,7 +9473,7 @@
               <w:rPr>
                 <w:sz w:val="19"/>
               </w:rPr>
-              <w:t>. Packaged builds are not affected</w:t>
+              <w:t>. Packaged builds were never affected</w:t>
             </w:r>
           </w:p>
         </w:tc>
@@ -9469,7 +9481,7 @@
       <w:tr>
         <w:tc>
           <w:tcPr>
-            <w:tcW w:type="dxa" w:w="4284"/>
+            <w:tcW w:type="dxa" w:w="4819"/>
             <w:tcMar>
               <w:top w:w="60" w:type="dxa"/>
               <w:bottom w:w="60" w:type="dxa"/>
@@ -9493,7 +9505,7 @@
         </w:tc>
         <w:tc>
           <w:tcPr>
-            <w:tcW w:type="dxa" w:w="5354"/>
+            <w:tcW w:type="dxa" w:w="4819"/>
             <w:tcMar>
               <w:top w:w="60" w:type="dxa"/>
               <w:bottom w:w="60" w:type="dxa"/>
@@ -9532,7 +9544,7 @@
       <w:tr>
         <w:tc>
           <w:tcPr>
-            <w:tcW w:type="dxa" w:w="4284"/>
+            <w:tcW w:type="dxa" w:w="4819"/>
             <w:tcMar>
               <w:top w:w="60" w:type="dxa"/>
               <w:bottom w:w="60" w:type="dxa"/>
@@ -9555,7 +9567,7 @@
         </w:tc>
         <w:tc>
           <w:tcPr>
-            <w:tcW w:type="dxa" w:w="5354"/>
+            <w:tcW w:type="dxa" w:w="4819"/>
             <w:tcMar>
               <w:top w:w="60" w:type="dxa"/>
               <w:bottom w:w="60" w:type="dxa"/>
@@ -9579,7 +9591,7 @@
       <w:tr>
         <w:tc>
           <w:tcPr>
-            <w:tcW w:type="dxa" w:w="4284"/>
+            <w:tcW w:type="dxa" w:w="4819"/>
             <w:tcMar>
               <w:top w:w="60" w:type="dxa"/>
               <w:bottom w:w="60" w:type="dxa"/>
@@ -9603,7 +9615,7 @@
         </w:tc>
         <w:tc>
           <w:tcPr>
-            <w:tcW w:type="dxa" w:w="5354"/>
+            <w:tcW w:type="dxa" w:w="4819"/>
             <w:tcMar>
               <w:top w:w="60" w:type="dxa"/>
               <w:bottom w:w="60" w:type="dxa"/>
@@ -9642,7 +9654,7 @@
       <w:tr>
         <w:tc>
           <w:tcPr>
-            <w:tcW w:type="dxa" w:w="4284"/>
+            <w:tcW w:type="dxa" w:w="4819"/>
             <w:tcMar>
               <w:top w:w="60" w:type="dxa"/>
               <w:bottom w:w="60" w:type="dxa"/>
@@ -9665,7 +9677,7 @@
         </w:tc>
         <w:tc>
           <w:tcPr>
-            <w:tcW w:type="dxa" w:w="5354"/>
+            <w:tcW w:type="dxa" w:w="4819"/>
             <w:tcMar>
               <w:top w:w="60" w:type="dxa"/>
               <w:bottom w:w="60" w:type="dxa"/>
@@ -9702,7 +9714,7 @@
       <w:tr>
         <w:tc>
           <w:tcPr>
-            <w:tcW w:type="dxa" w:w="4284"/>
+            <w:tcW w:type="dxa" w:w="4819"/>
             <w:tcMar>
               <w:top w:w="60" w:type="dxa"/>
               <w:bottom w:w="60" w:type="dxa"/>
@@ -9726,7 +9738,7 @@
         </w:tc>
         <w:tc>
           <w:tcPr>
-            <w:tcW w:type="dxa" w:w="5354"/>
+            <w:tcW w:type="dxa" w:w="4819"/>
             <w:tcMar>
               <w:top w:w="60" w:type="dxa"/>
               <w:bottom w:w="60" w:type="dxa"/>
@@ -9751,7 +9763,7 @@
       <w:tr>
         <w:tc>
           <w:tcPr>
-            <w:tcW w:type="dxa" w:w="4284"/>
+            <w:tcW w:type="dxa" w:w="4819"/>
             <w:tcMar>
               <w:top w:w="60" w:type="dxa"/>
               <w:bottom w:w="60" w:type="dxa"/>
@@ -9781,7 +9793,7 @@
         </w:tc>
         <w:tc>
           <w:tcPr>
-            <w:tcW w:type="dxa" w:w="5354"/>
+            <w:tcW w:type="dxa" w:w="4819"/>
             <w:tcMar>
               <w:top w:w="60" w:type="dxa"/>
               <w:bottom w:w="60" w:type="dxa"/>
@@ -9832,7 +9844,7 @@
       <w:tr>
         <w:tc>
           <w:tcPr>
-            <w:tcW w:type="dxa" w:w="4284"/>
+            <w:tcW w:type="dxa" w:w="4819"/>
             <w:tcMar>
               <w:top w:w="60" w:type="dxa"/>
               <w:bottom w:w="60" w:type="dxa"/>
@@ -9868,7 +9880,7 @@
         </w:tc>
         <w:tc>
           <w:tcPr>
-            <w:tcW w:type="dxa" w:w="5354"/>
+            <w:tcW w:type="dxa" w:w="4819"/>
             <w:tcMar>
               <w:top w:w="60" w:type="dxa"/>
               <w:bottom w:w="60" w:type="dxa"/>
@@ -9920,7 +9932,7 @@
       <w:tr>
         <w:tc>
           <w:tcPr>
-            <w:tcW w:type="dxa" w:w="4284"/>
+            <w:tcW w:type="dxa" w:w="4819"/>
             <w:tcMar>
               <w:top w:w="60" w:type="dxa"/>
               <w:bottom w:w="60" w:type="dxa"/>
@@ -9943,7 +9955,7 @@
         </w:tc>
         <w:tc>
           <w:tcPr>
-            <w:tcW w:type="dxa" w:w="5354"/>
+            <w:tcW w:type="dxa" w:w="4819"/>
             <w:tcMar>
               <w:top w:w="60" w:type="dxa"/>
               <w:bottom w:w="60" w:type="dxa"/>
@@ -9989,7 +10001,7 @@
       <w:tr>
         <w:tc>
           <w:tcPr>
-            <w:tcW w:type="dxa" w:w="4284"/>
+            <w:tcW w:type="dxa" w:w="4819"/>
             <w:tcMar>
               <w:top w:w="60" w:type="dxa"/>
               <w:bottom w:w="60" w:type="dxa"/>
@@ -10012,7 +10024,7 @@
         </w:tc>
         <w:tc>
           <w:tcPr>
-            <w:tcW w:type="dxa" w:w="5354"/>
+            <w:tcW w:type="dxa" w:w="4819"/>
             <w:tcMar>
               <w:top w:w="60" w:type="dxa"/>
               <w:bottom w:w="60" w:type="dxa"/>
@@ -10037,7 +10049,7 @@
       <w:tr>
         <w:tc>
           <w:tcPr>
-            <w:tcW w:type="dxa" w:w="4284"/>
+            <w:tcW w:type="dxa" w:w="4819"/>
             <w:tcMar>
               <w:top w:w="60" w:type="dxa"/>
               <w:bottom w:w="60" w:type="dxa"/>
@@ -10060,7 +10072,7 @@
         </w:tc>
         <w:tc>
           <w:tcPr>
-            <w:tcW w:type="dxa" w:w="5354"/>
+            <w:tcW w:type="dxa" w:w="4819"/>
             <w:tcMar>
               <w:top w:w="60" w:type="dxa"/>
               <w:bottom w:w="60" w:type="dxa"/>
@@ -10097,7 +10109,7 @@
       <w:tr>
         <w:tc>
           <w:tcPr>
-            <w:tcW w:type="dxa" w:w="4284"/>
+            <w:tcW w:type="dxa" w:w="4819"/>
             <w:tcMar>
               <w:top w:w="60" w:type="dxa"/>
               <w:bottom w:w="60" w:type="dxa"/>
@@ -10121,7 +10133,7 @@
         </w:tc>
         <w:tc>
           <w:tcPr>
-            <w:tcW w:type="dxa" w:w="5354"/>
+            <w:tcW w:type="dxa" w:w="4819"/>
             <w:tcMar>
               <w:top w:w="60" w:type="dxa"/>
               <w:bottom w:w="60" w:type="dxa"/>
@@ -10154,7 +10166,7 @@
       <w:tr>
         <w:tc>
           <w:tcPr>
-            <w:tcW w:type="dxa" w:w="4284"/>
+            <w:tcW w:type="dxa" w:w="4819"/>
             <w:tcMar>
               <w:top w:w="60" w:type="dxa"/>
               <w:bottom w:w="60" w:type="dxa"/>
@@ -10177,7 +10189,7 @@
         </w:tc>
         <w:tc>
           <w:tcPr>
-            <w:tcW w:type="dxa" w:w="5354"/>
+            <w:tcW w:type="dxa" w:w="4819"/>
             <w:tcMar>
               <w:top w:w="60" w:type="dxa"/>
               <w:bottom w:w="60" w:type="dxa"/>
@@ -10230,7 +10242,7 @@
       <w:tr>
         <w:tc>
           <w:tcPr>
-            <w:tcW w:type="dxa" w:w="4284"/>
+            <w:tcW w:type="dxa" w:w="4819"/>
             <w:tcMar>
               <w:top w:w="60" w:type="dxa"/>
               <w:bottom w:w="60" w:type="dxa"/>
@@ -10254,7 +10266,7 @@
         </w:tc>
         <w:tc>
           <w:tcPr>
-            <w:tcW w:type="dxa" w:w="5354"/>
+            <w:tcW w:type="dxa" w:w="4819"/>
             <w:tcMar>
               <w:top w:w="60" w:type="dxa"/>
               <w:bottom w:w="60" w:type="dxa"/>
@@ -10293,7 +10305,7 @@
       <w:tr>
         <w:tc>
           <w:tcPr>
-            <w:tcW w:type="dxa" w:w="4284"/>
+            <w:tcW w:type="dxa" w:w="4819"/>
             <w:tcMar>
               <w:top w:w="60" w:type="dxa"/>
               <w:bottom w:w="60" w:type="dxa"/>
@@ -10316,7 +10328,7 @@
         </w:tc>
         <w:tc>
           <w:tcPr>
-            <w:tcW w:type="dxa" w:w="5354"/>
+            <w:tcW w:type="dxa" w:w="4819"/>
             <w:tcMar>
               <w:top w:w="60" w:type="dxa"/>
               <w:bottom w:w="60" w:type="dxa"/>

</xml_diff>

<commit_message>
Release 0.7.0: NetLens, App Launchers, dev-server fixes
Co-Authored-By: Claude Opus 5.5 <noreply@anthropic.com>
</commit_message>
<xml_diff>
--- a/docs/word/SysPulse Installation Guide.docx
+++ b/docs/word/SysPulse Installation Guide.docx
@@ -101,7 +101,7 @@
           <w:b/>
           <w:sz w:val="21"/>
         </w:rPr>
-        <w:t>0.6.0</w:t>
+        <w:t>0.7.0</w:t>
       </w:r>
     </w:p>
     <w:p>
@@ -1249,7 +1249,7 @@
                 <w:color w:val="1F2937"/>
                 <w:sz w:val="18"/>
               </w:rPr>
-              <w:t>sudo apt install ./SysPulse_0.6.0_amd64.deb</w:t>
+              <w:t>sudo apt install ./SysPulse_0.7.0_amd64.deb</w:t>
             </w:r>
           </w:p>
         </w:tc>
@@ -1716,7 +1716,7 @@
                 <w:color w:val="1F2937"/>
                 <w:sz w:val="18"/>
               </w:rPr>
-              <w:t>chmod +x SysPulse_0.6.0_amd64.AppImage</w:t>
+              <w:t>chmod +x SysPulse_0.7.0_amd64.AppImage</w:t>
               <w:br/>
             </w:r>
             <w:r>
@@ -1725,7 +1725,7 @@
                 <w:color w:val="1F2937"/>
                 <w:sz w:val="18"/>
               </w:rPr>
-              <w:t>./SysPulse_0.6.0_amd64.AppImage</w:t>
+              <w:t>./SysPulse_0.7.0_amd64.AppImage</w:t>
             </w:r>
           </w:p>
         </w:tc>

</xml_diff>